<commit_message>
Fix report: images clipped by fixed line spacing
</commit_message>
<xml_diff>
--- a/docs/学生成绩管理系统课程设计报告.docx
+++ b/docs/学生成绩管理系统课程设计报告.docx
@@ -249,6 +249,7 @@
     </w:p>
     <w:p>
       <w:pPr>
+        <w:spacing w:line="0" w:lineRule="auto"/>
         <w:jc w:val="center"/>
       </w:pPr>
       <w:r>
@@ -315,6 +316,7 @@
     </w:p>
     <w:p>
       <w:pPr>
+        <w:spacing w:line="0" w:lineRule="auto"/>
         <w:jc w:val="center"/>
       </w:pPr>
       <w:r>
@@ -408,6 +410,7 @@
     </w:p>
     <w:p>
       <w:pPr>
+        <w:spacing w:line="0" w:lineRule="auto"/>
         <w:jc w:val="center"/>
       </w:pPr>
       <w:r>
@@ -1006,6 +1009,7 @@
     </w:p>
     <w:p>
       <w:pPr>
+        <w:spacing w:line="0" w:lineRule="auto"/>
         <w:jc w:val="center"/>
       </w:pPr>
       <w:r>
@@ -3735,6 +3739,7 @@
     </w:p>
     <w:p>
       <w:pPr>
+        <w:spacing w:line="0" w:lineRule="auto"/>
         <w:jc w:val="center"/>
       </w:pPr>
       <w:r>
@@ -3788,6 +3793,7 @@
     </w:p>
     <w:p>
       <w:pPr>
+        <w:spacing w:line="0" w:lineRule="auto"/>
         <w:jc w:val="center"/>
       </w:pPr>
       <w:r>
@@ -3841,6 +3847,7 @@
     </w:p>
     <w:p>
       <w:pPr>
+        <w:spacing w:line="0" w:lineRule="auto"/>
         <w:jc w:val="center"/>
       </w:pPr>
       <w:r>
@@ -3894,6 +3901,7 @@
     </w:p>
     <w:p>
       <w:pPr>
+        <w:spacing w:line="0" w:lineRule="auto"/>
         <w:jc w:val="center"/>
       </w:pPr>
       <w:r>
@@ -3947,6 +3955,7 @@
     </w:p>
     <w:p>
       <w:pPr>
+        <w:spacing w:line="0" w:lineRule="auto"/>
         <w:jc w:val="center"/>
       </w:pPr>
       <w:r>
@@ -4000,6 +4009,7 @@
     </w:p>
     <w:p>
       <w:pPr>
+        <w:spacing w:line="0" w:lineRule="auto"/>
         <w:jc w:val="center"/>
       </w:pPr>
       <w:r>

</xml_diff>

<commit_message>
Fix report image paragraph spacing (line=0 caused clipped images)
</commit_message>
<xml_diff>
--- a/docs/学生成绩管理系统课程设计报告.docx
+++ b/docs/学生成绩管理系统课程设计报告.docx
@@ -249,7 +249,7 @@
     </w:p>
     <w:p>
       <w:pPr>
-        <w:spacing w:line="0" w:lineRule="auto"/>
+        <w:spacing w:line="240" w:lineRule="auto"/>
         <w:jc w:val="center"/>
       </w:pPr>
       <w:r>
@@ -316,7 +316,7 @@
     </w:p>
     <w:p>
       <w:pPr>
-        <w:spacing w:line="0" w:lineRule="auto"/>
+        <w:spacing w:line="240" w:lineRule="auto"/>
         <w:jc w:val="center"/>
       </w:pPr>
       <w:r>
@@ -410,7 +410,7 @@
     </w:p>
     <w:p>
       <w:pPr>
-        <w:spacing w:line="0" w:lineRule="auto"/>
+        <w:spacing w:line="240" w:lineRule="auto"/>
         <w:jc w:val="center"/>
       </w:pPr>
       <w:r>
@@ -774,7 +774,7 @@
           </w:tcPr>
           <w:p>
             <w:pPr>
-              <w:spacing w:line="0" w:lineRule="auto"/>
+              <w:spacing w:line="240" w:lineRule="auto"/>
               <w:jc w:val="center"/>
             </w:pPr>
             <w:r>
@@ -795,7 +795,7 @@
           </w:tcPr>
           <w:p>
             <w:pPr>
-              <w:spacing w:line="0" w:lineRule="auto"/>
+              <w:spacing w:line="240" w:lineRule="auto"/>
             </w:pPr>
             <w:r>
               <w:rPr>
@@ -815,7 +815,7 @@
           </w:tcPr>
           <w:p>
             <w:pPr>
-              <w:spacing w:line="0" w:lineRule="auto"/>
+              <w:spacing w:line="240" w:lineRule="auto"/>
             </w:pPr>
             <w:r>
               <w:rPr>
@@ -1009,7 +1009,7 @@
     </w:p>
     <w:p>
       <w:pPr>
-        <w:spacing w:line="0" w:lineRule="auto"/>
+        <w:spacing w:line="240" w:lineRule="auto"/>
         <w:jc w:val="center"/>
       </w:pPr>
       <w:r>
@@ -1505,7 +1505,7 @@
           </w:tcPr>
           <w:p>
             <w:pPr>
-              <w:spacing w:line="0" w:lineRule="auto"/>
+              <w:spacing w:line="240" w:lineRule="auto"/>
               <w:jc w:val="center"/>
             </w:pPr>
             <w:r>
@@ -1526,7 +1526,7 @@
           </w:tcPr>
           <w:p>
             <w:pPr>
-              <w:spacing w:line="0" w:lineRule="auto"/>
+              <w:spacing w:line="240" w:lineRule="auto"/>
             </w:pPr>
             <w:r>
               <w:rPr>
@@ -1546,7 +1546,7 @@
           </w:tcPr>
           <w:p>
             <w:pPr>
-              <w:spacing w:line="0" w:lineRule="auto"/>
+              <w:spacing w:line="240" w:lineRule="auto"/>
             </w:pPr>
             <w:r>
               <w:rPr>
@@ -1641,7 +1641,7 @@
           </w:tcPr>
           <w:p>
             <w:pPr>
-              <w:spacing w:line="0" w:lineRule="auto"/>
+              <w:spacing w:line="240" w:lineRule="auto"/>
               <w:jc w:val="center"/>
             </w:pPr>
             <w:r>
@@ -1662,7 +1662,7 @@
           </w:tcPr>
           <w:p>
             <w:pPr>
-              <w:spacing w:line="0" w:lineRule="auto"/>
+              <w:spacing w:line="240" w:lineRule="auto"/>
             </w:pPr>
             <w:r>
               <w:rPr>
@@ -1682,7 +1682,7 @@
           </w:tcPr>
           <w:p>
             <w:pPr>
-              <w:spacing w:line="0" w:lineRule="auto"/>
+              <w:spacing w:line="240" w:lineRule="auto"/>
             </w:pPr>
             <w:r>
               <w:rPr>
@@ -1792,7 +1792,7 @@
           </w:tcPr>
           <w:p>
             <w:pPr>
-              <w:spacing w:line="0" w:lineRule="auto"/>
+              <w:spacing w:line="240" w:lineRule="auto"/>
               <w:jc w:val="center"/>
             </w:pPr>
             <w:r>
@@ -1813,7 +1813,7 @@
           </w:tcPr>
           <w:p>
             <w:pPr>
-              <w:spacing w:line="0" w:lineRule="auto"/>
+              <w:spacing w:line="240" w:lineRule="auto"/>
             </w:pPr>
             <w:r>
               <w:rPr>
@@ -1833,7 +1833,7 @@
           </w:tcPr>
           <w:p>
             <w:pPr>
-              <w:spacing w:line="0" w:lineRule="auto"/>
+              <w:spacing w:line="240" w:lineRule="auto"/>
             </w:pPr>
             <w:r>
               <w:rPr>
@@ -1928,7 +1928,7 @@
           </w:tcPr>
           <w:p>
             <w:pPr>
-              <w:spacing w:line="0" w:lineRule="auto"/>
+              <w:spacing w:line="240" w:lineRule="auto"/>
               <w:jc w:val="center"/>
             </w:pPr>
             <w:r>
@@ -1949,7 +1949,7 @@
           </w:tcPr>
           <w:p>
             <w:pPr>
-              <w:spacing w:line="0" w:lineRule="auto"/>
+              <w:spacing w:line="240" w:lineRule="auto"/>
             </w:pPr>
             <w:r>
               <w:rPr>
@@ -1969,7 +1969,7 @@
           </w:tcPr>
           <w:p>
             <w:pPr>
-              <w:spacing w:line="0" w:lineRule="auto"/>
+              <w:spacing w:line="240" w:lineRule="auto"/>
             </w:pPr>
             <w:r>
               <w:rPr>
@@ -2080,7 +2080,7 @@
           </w:tcPr>
           <w:p>
             <w:pPr>
-              <w:spacing w:line="0" w:lineRule="auto"/>
+              <w:spacing w:line="240" w:lineRule="auto"/>
               <w:jc w:val="center"/>
             </w:pPr>
             <w:r>
@@ -2101,7 +2101,7 @@
           </w:tcPr>
           <w:p>
             <w:pPr>
-              <w:spacing w:line="0" w:lineRule="auto"/>
+              <w:spacing w:line="240" w:lineRule="auto"/>
             </w:pPr>
             <w:r>
               <w:rPr>
@@ -2121,7 +2121,7 @@
           </w:tcPr>
           <w:p>
             <w:pPr>
-              <w:spacing w:line="0" w:lineRule="auto"/>
+              <w:spacing w:line="240" w:lineRule="auto"/>
             </w:pPr>
             <w:r>
               <w:rPr>
@@ -3739,7 +3739,7 @@
     </w:p>
     <w:p>
       <w:pPr>
-        <w:spacing w:line="0" w:lineRule="auto"/>
+        <w:spacing w:line="240" w:lineRule="auto"/>
         <w:jc w:val="center"/>
       </w:pPr>
       <w:r>
@@ -3793,7 +3793,7 @@
     </w:p>
     <w:p>
       <w:pPr>
-        <w:spacing w:line="0" w:lineRule="auto"/>
+        <w:spacing w:line="240" w:lineRule="auto"/>
         <w:jc w:val="center"/>
       </w:pPr>
       <w:r>
@@ -3847,7 +3847,7 @@
     </w:p>
     <w:p>
       <w:pPr>
-        <w:spacing w:line="0" w:lineRule="auto"/>
+        <w:spacing w:line="240" w:lineRule="auto"/>
         <w:jc w:val="center"/>
       </w:pPr>
       <w:r>
@@ -3901,7 +3901,7 @@
     </w:p>
     <w:p>
       <w:pPr>
-        <w:spacing w:line="0" w:lineRule="auto"/>
+        <w:spacing w:line="240" w:lineRule="auto"/>
         <w:jc w:val="center"/>
       </w:pPr>
       <w:r>
@@ -3955,7 +3955,7 @@
     </w:p>
     <w:p>
       <w:pPr>
-        <w:spacing w:line="0" w:lineRule="auto"/>
+        <w:spacing w:line="240" w:lineRule="auto"/>
         <w:jc w:val="center"/>
       </w:pPr>
       <w:r>
@@ -4009,7 +4009,7 @@
     </w:p>
     <w:p>
       <w:pPr>
-        <w:spacing w:line="0" w:lineRule="auto"/>
+        <w:spacing w:line="240" w:lineRule="auto"/>
         <w:jc w:val="center"/>
       </w:pPr>
       <w:r>

</xml_diff>

<commit_message>
Left-align code blocks in report
</commit_message>
<xml_diff>
--- a/docs/学生成绩管理系统课程设计报告.docx
+++ b/docs/学生成绩管理系统课程设计报告.docx
@@ -816,139 +816,541 @@
           <w:p>
             <w:pPr>
               <w:spacing w:line="240" w:lineRule="auto"/>
+              <w:jc w:val="left"/>
             </w:pPr>
             <w:r>
               <w:rPr>
-                <w:rFonts w:ascii="Times New Roman" w:hAnsi="Times New Roman" w:eastAsia="Times New Roman"/>
-                <w:b w:val="0"/>
+                <w:rFonts w:ascii="Times New Roman" w:hAnsi="Times New Roman" w:eastAsia="宋体"/>
                 <w:sz w:val="18"/>
               </w:rPr>
               <w:t>-- 学生成绩管理系统 数据库建表脚本</w:t>
               <w:br/>
+            </w:r>
+            <w:r>
+              <w:rPr>
+                <w:rFonts w:ascii="Times New Roman" w:hAnsi="Times New Roman" w:eastAsia="宋体"/>
+                <w:sz w:val="18"/>
+              </w:rPr>
               <w:t>DROP DATABASE IF EXISTS sms;</w:t>
               <w:br/>
+            </w:r>
+            <w:r>
+              <w:rPr>
+                <w:rFonts w:ascii="Times New Roman" w:hAnsi="Times New Roman" w:eastAsia="宋体"/>
+                <w:sz w:val="18"/>
+              </w:rPr>
               <w:t>CREATE DATABASE sms DEFAULT CHARACTER SET utf8mb4 COLLATE utf8mb4_general_ci;</w:t>
               <w:br/>
+            </w:r>
+            <w:r>
+              <w:rPr>
+                <w:rFonts w:ascii="Times New Roman" w:hAnsi="Times New Roman" w:eastAsia="宋体"/>
+                <w:sz w:val="18"/>
+              </w:rPr>
               <w:t>USE sms;</w:t>
               <w:br/>
+            </w:r>
+            <w:r>
+              <w:rPr>
+                <w:rFonts w:ascii="Times New Roman" w:hAnsi="Times New Roman" w:eastAsia="宋体"/>
+                <w:sz w:val="18"/>
+              </w:rPr>
               <w:br/>
+            </w:r>
+            <w:r>
+              <w:rPr>
+                <w:rFonts w:ascii="Times New Roman" w:hAnsi="Times New Roman" w:eastAsia="宋体"/>
+                <w:sz w:val="18"/>
+              </w:rPr>
               <w:t>-- 用户表（登录校验）</w:t>
               <w:br/>
+            </w:r>
+            <w:r>
+              <w:rPr>
+                <w:rFonts w:ascii="Times New Roman" w:hAnsi="Times New Roman" w:eastAsia="宋体"/>
+                <w:sz w:val="18"/>
+              </w:rPr>
               <w:t>CREATE TABLE t_user (</w:t>
               <w:br/>
+            </w:r>
+            <w:r>
+              <w:rPr>
+                <w:rFonts w:ascii="Times New Roman" w:hAnsi="Times New Roman" w:eastAsia="宋体"/>
+                <w:sz w:val="18"/>
+              </w:rPr>
               <w:t xml:space="preserve">    id INT PRIMARY KEY AUTO_INCREMENT COMMENT '主键',</w:t>
               <w:br/>
+            </w:r>
+            <w:r>
+              <w:rPr>
+                <w:rFonts w:ascii="Times New Roman" w:hAnsi="Times New Roman" w:eastAsia="宋体"/>
+                <w:sz w:val="18"/>
+              </w:rPr>
               <w:t xml:space="preserve">    username VARCHAR(30) NOT NULL UNIQUE COMMENT '用户名',</w:t>
               <w:br/>
+            </w:r>
+            <w:r>
+              <w:rPr>
+                <w:rFonts w:ascii="Times New Roman" w:hAnsi="Times New Roman" w:eastAsia="宋体"/>
+                <w:sz w:val="18"/>
+              </w:rPr>
               <w:t xml:space="preserve">    password VARCHAR(64) NOT NULL COMMENT '密码',</w:t>
               <w:br/>
+            </w:r>
+            <w:r>
+              <w:rPr>
+                <w:rFonts w:ascii="Times New Roman" w:hAnsi="Times New Roman" w:eastAsia="宋体"/>
+                <w:sz w:val="18"/>
+              </w:rPr>
               <w:t xml:space="preserve">    role VARCHAR(10) NOT NULL DEFAULT 'admin' COMMENT '角色'</w:t>
               <w:br/>
+            </w:r>
+            <w:r>
+              <w:rPr>
+                <w:rFonts w:ascii="Times New Roman" w:hAnsi="Times New Roman" w:eastAsia="宋体"/>
+                <w:sz w:val="18"/>
+              </w:rPr>
               <w:t>) COMMENT '系统用户表';</w:t>
               <w:br/>
+            </w:r>
+            <w:r>
+              <w:rPr>
+                <w:rFonts w:ascii="Times New Roman" w:hAnsi="Times New Roman" w:eastAsia="宋体"/>
+                <w:sz w:val="18"/>
+              </w:rPr>
               <w:br/>
+            </w:r>
+            <w:r>
+              <w:rPr>
+                <w:rFonts w:ascii="Times New Roman" w:hAnsi="Times New Roman" w:eastAsia="宋体"/>
+                <w:sz w:val="18"/>
+              </w:rPr>
               <w:t>-- 学生表</w:t>
               <w:br/>
+            </w:r>
+            <w:r>
+              <w:rPr>
+                <w:rFonts w:ascii="Times New Roman" w:hAnsi="Times New Roman" w:eastAsia="宋体"/>
+                <w:sz w:val="18"/>
+              </w:rPr>
               <w:t>CREATE TABLE t_student (</w:t>
               <w:br/>
+            </w:r>
+            <w:r>
+              <w:rPr>
+                <w:rFonts w:ascii="Times New Roman" w:hAnsi="Times New Roman" w:eastAsia="宋体"/>
+                <w:sz w:val="18"/>
+              </w:rPr>
               <w:t xml:space="preserve">    student_no VARCHAR(20) PRIMARY KEY COMMENT '学号',</w:t>
               <w:br/>
+            </w:r>
+            <w:r>
+              <w:rPr>
+                <w:rFonts w:ascii="Times New Roman" w:hAnsi="Times New Roman" w:eastAsia="宋体"/>
+                <w:sz w:val="18"/>
+              </w:rPr>
               <w:t xml:space="preserve">    name VARCHAR(30) NOT NULL COMMENT '姓名',</w:t>
               <w:br/>
+            </w:r>
+            <w:r>
+              <w:rPr>
+                <w:rFonts w:ascii="Times New Roman" w:hAnsi="Times New Roman" w:eastAsia="宋体"/>
+                <w:sz w:val="18"/>
+              </w:rPr>
               <w:t xml:space="preserve">    gender VARCHAR(2) NOT NULL DEFAULT '男' COMMENT '性别',</w:t>
               <w:br/>
+            </w:r>
+            <w:r>
+              <w:rPr>
+                <w:rFonts w:ascii="Times New Roman" w:hAnsi="Times New Roman" w:eastAsia="宋体"/>
+                <w:sz w:val="18"/>
+              </w:rPr>
               <w:t xml:space="preserve">    age INT NOT NULL COMMENT '年龄',</w:t>
               <w:br/>
+            </w:r>
+            <w:r>
+              <w:rPr>
+                <w:rFonts w:ascii="Times New Roman" w:hAnsi="Times New Roman" w:eastAsia="宋体"/>
+                <w:sz w:val="18"/>
+              </w:rPr>
               <w:t xml:space="preserve">    major VARCHAR(50) NOT NULL COMMENT '专业',</w:t>
               <w:br/>
+            </w:r>
+            <w:r>
+              <w:rPr>
+                <w:rFonts w:ascii="Times New Roman" w:hAnsi="Times New Roman" w:eastAsia="宋体"/>
+                <w:sz w:val="18"/>
+              </w:rPr>
               <w:t xml:space="preserve">    class_name VARCHAR(30) NOT NULL COMMENT '班级',</w:t>
               <w:br/>
+            </w:r>
+            <w:r>
+              <w:rPr>
+                <w:rFonts w:ascii="Times New Roman" w:hAnsi="Times New Roman" w:eastAsia="宋体"/>
+                <w:sz w:val="18"/>
+              </w:rPr>
               <w:t xml:space="preserve">    phone VARCHAR(20) COMMENT '联系电话',</w:t>
               <w:br/>
+            </w:r>
+            <w:r>
+              <w:rPr>
+                <w:rFonts w:ascii="Times New Roman" w:hAnsi="Times New Roman" w:eastAsia="宋体"/>
+                <w:sz w:val="18"/>
+              </w:rPr>
               <w:t xml:space="preserve">    CONSTRAINT chk_age CHECK (age BETWEEN 10 AND 60)</w:t>
               <w:br/>
+            </w:r>
+            <w:r>
+              <w:rPr>
+                <w:rFonts w:ascii="Times New Roman" w:hAnsi="Times New Roman" w:eastAsia="宋体"/>
+                <w:sz w:val="18"/>
+              </w:rPr>
               <w:t>) COMMENT '学生信息表';</w:t>
               <w:br/>
+            </w:r>
+            <w:r>
+              <w:rPr>
+                <w:rFonts w:ascii="Times New Roman" w:hAnsi="Times New Roman" w:eastAsia="宋体"/>
+                <w:sz w:val="18"/>
+              </w:rPr>
               <w:br/>
+            </w:r>
+            <w:r>
+              <w:rPr>
+                <w:rFonts w:ascii="Times New Roman" w:hAnsi="Times New Roman" w:eastAsia="宋体"/>
+                <w:sz w:val="18"/>
+              </w:rPr>
               <w:t>-- 课程表</w:t>
               <w:br/>
+            </w:r>
+            <w:r>
+              <w:rPr>
+                <w:rFonts w:ascii="Times New Roman" w:hAnsi="Times New Roman" w:eastAsia="宋体"/>
+                <w:sz w:val="18"/>
+              </w:rPr>
               <w:t>CREATE TABLE t_course (</w:t>
               <w:br/>
+            </w:r>
+            <w:r>
+              <w:rPr>
+                <w:rFonts w:ascii="Times New Roman" w:hAnsi="Times New Roman" w:eastAsia="宋体"/>
+                <w:sz w:val="18"/>
+              </w:rPr>
               <w:t xml:space="preserve">    course_no VARCHAR(20) PRIMARY KEY COMMENT '课程编号',</w:t>
               <w:br/>
+            </w:r>
+            <w:r>
+              <w:rPr>
+                <w:rFonts w:ascii="Times New Roman" w:hAnsi="Times New Roman" w:eastAsia="宋体"/>
+                <w:sz w:val="18"/>
+              </w:rPr>
               <w:t xml:space="preserve">    course_name VARCHAR(50) NOT NULL COMMENT '课程名称',</w:t>
               <w:br/>
+            </w:r>
+            <w:r>
+              <w:rPr>
+                <w:rFonts w:ascii="Times New Roman" w:hAnsi="Times New Roman" w:eastAsia="宋体"/>
+                <w:sz w:val="18"/>
+              </w:rPr>
               <w:t xml:space="preserve">    credit DECIMAL(3,1) NOT NULL COMMENT '学分',</w:t>
               <w:br/>
+            </w:r>
+            <w:r>
+              <w:rPr>
+                <w:rFonts w:ascii="Times New Roman" w:hAnsi="Times New Roman" w:eastAsia="宋体"/>
+                <w:sz w:val="18"/>
+              </w:rPr>
               <w:t xml:space="preserve">    teacher VARCHAR(30) COMMENT '任课教师'</w:t>
               <w:br/>
+            </w:r>
+            <w:r>
+              <w:rPr>
+                <w:rFonts w:ascii="Times New Roman" w:hAnsi="Times New Roman" w:eastAsia="宋体"/>
+                <w:sz w:val="18"/>
+              </w:rPr>
               <w:t>) COMMENT '课程信息表';</w:t>
               <w:br/>
+            </w:r>
+            <w:r>
+              <w:rPr>
+                <w:rFonts w:ascii="Times New Roman" w:hAnsi="Times New Roman" w:eastAsia="宋体"/>
+                <w:sz w:val="18"/>
+              </w:rPr>
               <w:br/>
+            </w:r>
+            <w:r>
+              <w:rPr>
+                <w:rFonts w:ascii="Times New Roman" w:hAnsi="Times New Roman" w:eastAsia="宋体"/>
+                <w:sz w:val="18"/>
+              </w:rPr>
               <w:t>-- 成绩表（学生-课程 多对多联系）</w:t>
               <w:br/>
+            </w:r>
+            <w:r>
+              <w:rPr>
+                <w:rFonts w:ascii="Times New Roman" w:hAnsi="Times New Roman" w:eastAsia="宋体"/>
+                <w:sz w:val="18"/>
+              </w:rPr>
               <w:t>CREATE TABLE t_score (</w:t>
               <w:br/>
+            </w:r>
+            <w:r>
+              <w:rPr>
+                <w:rFonts w:ascii="Times New Roman" w:hAnsi="Times New Roman" w:eastAsia="宋体"/>
+                <w:sz w:val="18"/>
+              </w:rPr>
               <w:t xml:space="preserve">    id INT PRIMARY KEY AUTO_INCREMENT COMMENT '主键',</w:t>
               <w:br/>
+            </w:r>
+            <w:r>
+              <w:rPr>
+                <w:rFonts w:ascii="Times New Roman" w:hAnsi="Times New Roman" w:eastAsia="宋体"/>
+                <w:sz w:val="18"/>
+              </w:rPr>
               <w:t xml:space="preserve">    student_no VARCHAR(20) NOT NULL COMMENT '学号',</w:t>
               <w:br/>
+            </w:r>
+            <w:r>
+              <w:rPr>
+                <w:rFonts w:ascii="Times New Roman" w:hAnsi="Times New Roman" w:eastAsia="宋体"/>
+                <w:sz w:val="18"/>
+              </w:rPr>
               <w:t xml:space="preserve">    course_no VARCHAR(20) NOT NULL COMMENT '课程编号',</w:t>
               <w:br/>
+            </w:r>
+            <w:r>
+              <w:rPr>
+                <w:rFonts w:ascii="Times New Roman" w:hAnsi="Times New Roman" w:eastAsia="宋体"/>
+                <w:sz w:val="18"/>
+              </w:rPr>
               <w:t xml:space="preserve">    score DECIMAL(5,2) NOT NULL COMMENT '成绩',</w:t>
               <w:br/>
+            </w:r>
+            <w:r>
+              <w:rPr>
+                <w:rFonts w:ascii="Times New Roman" w:hAnsi="Times New Roman" w:eastAsia="宋体"/>
+                <w:sz w:val="18"/>
+              </w:rPr>
               <w:t xml:space="preserve">    UNIQUE KEY uk_stu_course (student_no, course_no),</w:t>
               <w:br/>
+            </w:r>
+            <w:r>
+              <w:rPr>
+                <w:rFonts w:ascii="Times New Roman" w:hAnsi="Times New Roman" w:eastAsia="宋体"/>
+                <w:sz w:val="18"/>
+              </w:rPr>
               <w:t xml:space="preserve">    CONSTRAINT fk_score_student FOREIGN KEY (student_no)</w:t>
               <w:br/>
+            </w:r>
+            <w:r>
+              <w:rPr>
+                <w:rFonts w:ascii="Times New Roman" w:hAnsi="Times New Roman" w:eastAsia="宋体"/>
+                <w:sz w:val="18"/>
+              </w:rPr>
               <w:t xml:space="preserve">        REFERENCES t_student (student_no) ON DELETE CASCADE,</w:t>
               <w:br/>
+            </w:r>
+            <w:r>
+              <w:rPr>
+                <w:rFonts w:ascii="Times New Roman" w:hAnsi="Times New Roman" w:eastAsia="宋体"/>
+                <w:sz w:val="18"/>
+              </w:rPr>
               <w:t xml:space="preserve">    CONSTRAINT fk_score_course FOREIGN KEY (course_no)</w:t>
               <w:br/>
+            </w:r>
+            <w:r>
+              <w:rPr>
+                <w:rFonts w:ascii="Times New Roman" w:hAnsi="Times New Roman" w:eastAsia="宋体"/>
+                <w:sz w:val="18"/>
+              </w:rPr>
               <w:t xml:space="preserve">        REFERENCES t_course (course_no) ON DELETE CASCADE,</w:t>
               <w:br/>
+            </w:r>
+            <w:r>
+              <w:rPr>
+                <w:rFonts w:ascii="Times New Roman" w:hAnsi="Times New Roman" w:eastAsia="宋体"/>
+                <w:sz w:val="18"/>
+              </w:rPr>
               <w:t xml:space="preserve">    CONSTRAINT chk_score CHECK (score BETWEEN 0 AND 100)</w:t>
               <w:br/>
+            </w:r>
+            <w:r>
+              <w:rPr>
+                <w:rFonts w:ascii="Times New Roman" w:hAnsi="Times New Roman" w:eastAsia="宋体"/>
+                <w:sz w:val="18"/>
+              </w:rPr>
               <w:t>) COMMENT '成绩表';</w:t>
               <w:br/>
+            </w:r>
+            <w:r>
+              <w:rPr>
+                <w:rFonts w:ascii="Times New Roman" w:hAnsi="Times New Roman" w:eastAsia="宋体"/>
+                <w:sz w:val="18"/>
+              </w:rPr>
               <w:br/>
+            </w:r>
+            <w:r>
+              <w:rPr>
+                <w:rFonts w:ascii="Times New Roman" w:hAnsi="Times New Roman" w:eastAsia="宋体"/>
+                <w:sz w:val="18"/>
+              </w:rPr>
               <w:t>-- 初始数据</w:t>
               <w:br/>
+            </w:r>
+            <w:r>
+              <w:rPr>
+                <w:rFonts w:ascii="Times New Roman" w:hAnsi="Times New Roman" w:eastAsia="宋体"/>
+                <w:sz w:val="18"/>
+              </w:rPr>
               <w:t>INSERT INTO t_user (username, password, role) VALUES ('admin', 'admin123', 'admin');</w:t>
               <w:br/>
+            </w:r>
+            <w:r>
+              <w:rPr>
+                <w:rFonts w:ascii="Times New Roman" w:hAnsi="Times New Roman" w:eastAsia="宋体"/>
+                <w:sz w:val="18"/>
+              </w:rPr>
               <w:br/>
+            </w:r>
+            <w:r>
+              <w:rPr>
+                <w:rFonts w:ascii="Times New Roman" w:hAnsi="Times New Roman" w:eastAsia="宋体"/>
+                <w:sz w:val="18"/>
+              </w:rPr>
               <w:t>INSERT INTO t_student VALUES</w:t>
               <w:br/>
+            </w:r>
+            <w:r>
+              <w:rPr>
+                <w:rFonts w:ascii="Times New Roman" w:hAnsi="Times New Roman" w:eastAsia="宋体"/>
+                <w:sz w:val="18"/>
+              </w:rPr>
               <w:t>('2023001', '张三', '男', 20, '计算机科学与技术', '计科2301', '13800000001'),</w:t>
               <w:br/>
+            </w:r>
+            <w:r>
+              <w:rPr>
+                <w:rFonts w:ascii="Times New Roman" w:hAnsi="Times New Roman" w:eastAsia="宋体"/>
+                <w:sz w:val="18"/>
+              </w:rPr>
               <w:t>('2023002', '李四', '女', 19, '计算机科学与技术', '计科2301', '13800000002'),</w:t>
               <w:br/>
+            </w:r>
+            <w:r>
+              <w:rPr>
+                <w:rFonts w:ascii="Times New Roman" w:hAnsi="Times New Roman" w:eastAsia="宋体"/>
+                <w:sz w:val="18"/>
+              </w:rPr>
               <w:t>('2023003', '王五', '男', 21, '软件工程', '软工2302', '13800000003'),</w:t>
               <w:br/>
+            </w:r>
+            <w:r>
+              <w:rPr>
+                <w:rFonts w:ascii="Times New Roman" w:hAnsi="Times New Roman" w:eastAsia="宋体"/>
+                <w:sz w:val="18"/>
+              </w:rPr>
               <w:t>('2023004', '赵六', '女', 20, '软件工程', '软工2302', '13800000004'),</w:t>
               <w:br/>
+            </w:r>
+            <w:r>
+              <w:rPr>
+                <w:rFonts w:ascii="Times New Roman" w:hAnsi="Times New Roman" w:eastAsia="宋体"/>
+                <w:sz w:val="18"/>
+              </w:rPr>
               <w:t>('2023005', '孙七', '男', 22, '数据科学与大数据技术', '数据2301', '13800000005');</w:t>
               <w:br/>
+            </w:r>
+            <w:r>
+              <w:rPr>
+                <w:rFonts w:ascii="Times New Roman" w:hAnsi="Times New Roman" w:eastAsia="宋体"/>
+                <w:sz w:val="18"/>
+              </w:rPr>
               <w:br/>
+            </w:r>
+            <w:r>
+              <w:rPr>
+                <w:rFonts w:ascii="Times New Roman" w:hAnsi="Times New Roman" w:eastAsia="宋体"/>
+                <w:sz w:val="18"/>
+              </w:rPr>
               <w:t>INSERT INTO t_course VALUES</w:t>
               <w:br/>
+            </w:r>
+            <w:r>
+              <w:rPr>
+                <w:rFonts w:ascii="Times New Roman" w:hAnsi="Times New Roman" w:eastAsia="宋体"/>
+                <w:sz w:val="18"/>
+              </w:rPr>
               <w:t>('C001', 'Java面向对象程序设计', 4.0, '陈老师'),</w:t>
               <w:br/>
+            </w:r>
+            <w:r>
+              <w:rPr>
+                <w:rFonts w:ascii="Times New Roman" w:hAnsi="Times New Roman" w:eastAsia="宋体"/>
+                <w:sz w:val="18"/>
+              </w:rPr>
               <w:t>('C002', '数据库原理', 3.5, '刘老师'),</w:t>
               <w:br/>
+            </w:r>
+            <w:r>
+              <w:rPr>
+                <w:rFonts w:ascii="Times New Roman" w:hAnsi="Times New Roman" w:eastAsia="宋体"/>
+                <w:sz w:val="18"/>
+              </w:rPr>
               <w:t>('C003', '数据结构', 4.0, '杨老师');</w:t>
               <w:br/>
+            </w:r>
+            <w:r>
+              <w:rPr>
+                <w:rFonts w:ascii="Times New Roman" w:hAnsi="Times New Roman" w:eastAsia="宋体"/>
+                <w:sz w:val="18"/>
+              </w:rPr>
               <w:br/>
+            </w:r>
+            <w:r>
+              <w:rPr>
+                <w:rFonts w:ascii="Times New Roman" w:hAnsi="Times New Roman" w:eastAsia="宋体"/>
+                <w:sz w:val="18"/>
+              </w:rPr>
               <w:t>INSERT INTO t_score (student_no, course_no, score) VALUES</w:t>
               <w:br/>
+            </w:r>
+            <w:r>
+              <w:rPr>
+                <w:rFonts w:ascii="Times New Roman" w:hAnsi="Times New Roman" w:eastAsia="宋体"/>
+                <w:sz w:val="18"/>
+              </w:rPr>
               <w:t>('2023001', 'C001', 88), ('2023001', 'C002', 76), ('2023001', 'C003', 92),</w:t>
               <w:br/>
+            </w:r>
+            <w:r>
+              <w:rPr>
+                <w:rFonts w:ascii="Times New Roman" w:hAnsi="Times New Roman" w:eastAsia="宋体"/>
+                <w:sz w:val="18"/>
+              </w:rPr>
               <w:t>('2023002', 'C001', 95), ('2023002', 'C002', 84),</w:t>
               <w:br/>
+            </w:r>
+            <w:r>
+              <w:rPr>
+                <w:rFonts w:ascii="Times New Roman" w:hAnsi="Times New Roman" w:eastAsia="宋体"/>
+                <w:sz w:val="18"/>
+              </w:rPr>
               <w:t>('2023003', 'C001', 59), ('2023003', 'C003', 67),</w:t>
               <w:br/>
+            </w:r>
+            <w:r>
+              <w:rPr>
+                <w:rFonts w:ascii="Times New Roman" w:hAnsi="Times New Roman" w:eastAsia="宋体"/>
+                <w:sz w:val="18"/>
+              </w:rPr>
               <w:t>('2023004', 'C002', 73), ('2023004', 'C003', 81),</w:t>
               <w:br/>
+            </w:r>
+            <w:r>
+              <w:rPr>
+                <w:rFonts w:ascii="Times New Roman" w:hAnsi="Times New Roman" w:eastAsia="宋体"/>
+                <w:sz w:val="18"/>
+              </w:rPr>
               <w:t>('2023005', 'C001', 66);</w:t>
             </w:r>
           </w:p>
@@ -1547,58 +1949,202 @@
           <w:p>
             <w:pPr>
               <w:spacing w:line="240" w:lineRule="auto"/>
+              <w:jc w:val="left"/>
             </w:pPr>
             <w:r>
               <w:rPr>
-                <w:rFonts w:ascii="Times New Roman" w:hAnsi="Times New Roman" w:eastAsia="Times New Roman"/>
-                <w:b w:val="0"/>
+                <w:rFonts w:ascii="Times New Roman" w:hAnsi="Times New Roman" w:eastAsia="宋体"/>
                 <w:sz w:val="18"/>
               </w:rPr>
               <w:t>public class DBUtil {</w:t>
               <w:br/>
+            </w:r>
+            <w:r>
+              <w:rPr>
+                <w:rFonts w:ascii="Times New Roman" w:hAnsi="Times New Roman" w:eastAsia="宋体"/>
+                <w:sz w:val="18"/>
+              </w:rPr>
               <w:t xml:space="preserve">    private static final String URL = "jdbc:mysql://localhost:3306/sms?useUnicode=true"</w:t>
               <w:br/>
+            </w:r>
+            <w:r>
+              <w:rPr>
+                <w:rFonts w:ascii="Times New Roman" w:hAnsi="Times New Roman" w:eastAsia="宋体"/>
+                <w:sz w:val="18"/>
+              </w:rPr>
               <w:t xml:space="preserve">            + "&amp;characterEncoding=utf8&amp;serverTimezone=Asia/Shanghai&amp;useSSL=false"</w:t>
               <w:br/>
+            </w:r>
+            <w:r>
+              <w:rPr>
+                <w:rFonts w:ascii="Times New Roman" w:hAnsi="Times New Roman" w:eastAsia="宋体"/>
+                <w:sz w:val="18"/>
+              </w:rPr>
               <w:t xml:space="preserve">            + "&amp;allowPublicKeyRetrieval=true";</w:t>
               <w:br/>
+            </w:r>
+            <w:r>
+              <w:rPr>
+                <w:rFonts w:ascii="Times New Roman" w:hAnsi="Times New Roman" w:eastAsia="宋体"/>
+                <w:sz w:val="18"/>
+              </w:rPr>
               <w:t xml:space="preserve">    private static final String USER = "root";</w:t>
               <w:br/>
+            </w:r>
+            <w:r>
+              <w:rPr>
+                <w:rFonts w:ascii="Times New Roman" w:hAnsi="Times New Roman" w:eastAsia="宋体"/>
+                <w:sz w:val="18"/>
+              </w:rPr>
               <w:t xml:space="preserve">    private static final String PASSWORD = "";</w:t>
               <w:br/>
+            </w:r>
+            <w:r>
+              <w:rPr>
+                <w:rFonts w:ascii="Times New Roman" w:hAnsi="Times New Roman" w:eastAsia="宋体"/>
+                <w:sz w:val="18"/>
+              </w:rPr>
               <w:br/>
+            </w:r>
+            <w:r>
+              <w:rPr>
+                <w:rFonts w:ascii="Times New Roman" w:hAnsi="Times New Roman" w:eastAsia="宋体"/>
+                <w:sz w:val="18"/>
+              </w:rPr>
               <w:t xml:space="preserve">    static {</w:t>
               <w:br/>
+            </w:r>
+            <w:r>
+              <w:rPr>
+                <w:rFonts w:ascii="Times New Roman" w:hAnsi="Times New Roman" w:eastAsia="宋体"/>
+                <w:sz w:val="18"/>
+              </w:rPr>
               <w:t xml:space="preserve">        try {</w:t>
               <w:br/>
+            </w:r>
+            <w:r>
+              <w:rPr>
+                <w:rFonts w:ascii="Times New Roman" w:hAnsi="Times New Roman" w:eastAsia="宋体"/>
+                <w:sz w:val="18"/>
+              </w:rPr>
               <w:t xml:space="preserve">            Class.forName("com.mysql.cj.jdbc.Driver");</w:t>
               <w:br/>
+            </w:r>
+            <w:r>
+              <w:rPr>
+                <w:rFonts w:ascii="Times New Roman" w:hAnsi="Times New Roman" w:eastAsia="宋体"/>
+                <w:sz w:val="18"/>
+              </w:rPr>
               <w:t xml:space="preserve">        } catch (ClassNotFoundException e) {</w:t>
               <w:br/>
+            </w:r>
+            <w:r>
+              <w:rPr>
+                <w:rFonts w:ascii="Times New Roman" w:hAnsi="Times New Roman" w:eastAsia="宋体"/>
+                <w:sz w:val="18"/>
+              </w:rPr>
               <w:t xml:space="preserve">            throw new ExceptionInInitializerError("MySQL 驱动加载失败: " + e.getMessage());</w:t>
               <w:br/>
+            </w:r>
+            <w:r>
+              <w:rPr>
+                <w:rFonts w:ascii="Times New Roman" w:hAnsi="Times New Roman" w:eastAsia="宋体"/>
+                <w:sz w:val="18"/>
+              </w:rPr>
               <w:t xml:space="preserve">        }</w:t>
               <w:br/>
+            </w:r>
+            <w:r>
+              <w:rPr>
+                <w:rFonts w:ascii="Times New Roman" w:hAnsi="Times New Roman" w:eastAsia="宋体"/>
+                <w:sz w:val="18"/>
+              </w:rPr>
               <w:t xml:space="preserve">    }</w:t>
               <w:br/>
+            </w:r>
+            <w:r>
+              <w:rPr>
+                <w:rFonts w:ascii="Times New Roman" w:hAnsi="Times New Roman" w:eastAsia="宋体"/>
+                <w:sz w:val="18"/>
+              </w:rPr>
               <w:br/>
+            </w:r>
+            <w:r>
+              <w:rPr>
+                <w:rFonts w:ascii="Times New Roman" w:hAnsi="Times New Roman" w:eastAsia="宋体"/>
+                <w:sz w:val="18"/>
+              </w:rPr>
               <w:t xml:space="preserve">    public static Connection getConnection() throws SQLException {</w:t>
               <w:br/>
+            </w:r>
+            <w:r>
+              <w:rPr>
+                <w:rFonts w:ascii="Times New Roman" w:hAnsi="Times New Roman" w:eastAsia="宋体"/>
+                <w:sz w:val="18"/>
+              </w:rPr>
               <w:t xml:space="preserve">        return DriverManager.getConnection(URL, USER, PASSWORD);</w:t>
               <w:br/>
+            </w:r>
+            <w:r>
+              <w:rPr>
+                <w:rFonts w:ascii="Times New Roman" w:hAnsi="Times New Roman" w:eastAsia="宋体"/>
+                <w:sz w:val="18"/>
+              </w:rPr>
               <w:t xml:space="preserve">    }</w:t>
               <w:br/>
+            </w:r>
+            <w:r>
+              <w:rPr>
+                <w:rFonts w:ascii="Times New Roman" w:hAnsi="Times New Roman" w:eastAsia="宋体"/>
+                <w:sz w:val="18"/>
+              </w:rPr>
               <w:br/>
+            </w:r>
+            <w:r>
+              <w:rPr>
+                <w:rFonts w:ascii="Times New Roman" w:hAnsi="Times New Roman" w:eastAsia="宋体"/>
+                <w:sz w:val="18"/>
+              </w:rPr>
               <w:t xml:space="preserve">    public static void close(Connection conn, Statement stmt, ResultSet rs) {</w:t>
               <w:br/>
+            </w:r>
+            <w:r>
+              <w:rPr>
+                <w:rFonts w:ascii="Times New Roman" w:hAnsi="Times New Roman" w:eastAsia="宋体"/>
+                <w:sz w:val="18"/>
+              </w:rPr>
               <w:t xml:space="preserve">        if (rs != null) try { rs.close(); } catch (SQLException ignored) {}</w:t>
               <w:br/>
+            </w:r>
+            <w:r>
+              <w:rPr>
+                <w:rFonts w:ascii="Times New Roman" w:hAnsi="Times New Roman" w:eastAsia="宋体"/>
+                <w:sz w:val="18"/>
+              </w:rPr>
               <w:t xml:space="preserve">        if (stmt != null) try { stmt.close(); } catch (SQLException ignored) {}</w:t>
               <w:br/>
+            </w:r>
+            <w:r>
+              <w:rPr>
+                <w:rFonts w:ascii="Times New Roman" w:hAnsi="Times New Roman" w:eastAsia="宋体"/>
+                <w:sz w:val="18"/>
+              </w:rPr>
               <w:t xml:space="preserve">        if (conn != null) try { conn.close(); } catch (SQLException ignored) {}</w:t>
               <w:br/>
+            </w:r>
+            <w:r>
+              <w:rPr>
+                <w:rFonts w:ascii="Times New Roman" w:hAnsi="Times New Roman" w:eastAsia="宋体"/>
+                <w:sz w:val="18"/>
+              </w:rPr>
               <w:t xml:space="preserve">    }</w:t>
               <w:br/>
+            </w:r>
+            <w:r>
+              <w:rPr>
+                <w:rFonts w:ascii="Times New Roman" w:hAnsi="Times New Roman" w:eastAsia="宋体"/>
+                <w:sz w:val="18"/>
+              </w:rPr>
               <w:t>}</w:t>
             </w:r>
           </w:p>
@@ -1683,73 +2229,253 @@
           <w:p>
             <w:pPr>
               <w:spacing w:line="240" w:lineRule="auto"/>
+              <w:jc w:val="left"/>
             </w:pPr>
             <w:r>
               <w:rPr>
-                <w:rFonts w:ascii="Times New Roman" w:hAnsi="Times New Roman" w:eastAsia="Times New Roman"/>
-                <w:b w:val="0"/>
+                <w:rFonts w:ascii="Times New Roman" w:hAnsi="Times New Roman" w:eastAsia="宋体"/>
                 <w:sz w:val="18"/>
               </w:rPr>
               <w:t>public List&lt;CourseStat&gt; statByCourse() {</w:t>
               <w:br/>
+            </w:r>
+            <w:r>
+              <w:rPr>
+                <w:rFonts w:ascii="Times New Roman" w:hAnsi="Times New Roman" w:eastAsia="宋体"/>
+                <w:sz w:val="18"/>
+              </w:rPr>
               <w:t xml:space="preserve">    String sql = "SELECT c.course_no, c.course_name, COUNT(sc.id) AS cnt, "</w:t>
               <w:br/>
+            </w:r>
+            <w:r>
+              <w:rPr>
+                <w:rFonts w:ascii="Times New Roman" w:hAnsi="Times New Roman" w:eastAsia="宋体"/>
+                <w:sz w:val="18"/>
+              </w:rPr>
               <w:t xml:space="preserve">            + "ROUND(AVG(sc.score),2) AS avg_score, MAX(sc.score) AS max_score, "</w:t>
               <w:br/>
+            </w:r>
+            <w:r>
+              <w:rPr>
+                <w:rFonts w:ascii="Times New Roman" w:hAnsi="Times New Roman" w:eastAsia="宋体"/>
+                <w:sz w:val="18"/>
+              </w:rPr>
               <w:t xml:space="preserve">            + "MIN(sc.score) AS min_score, "</w:t>
               <w:br/>
+            </w:r>
+            <w:r>
+              <w:rPr>
+                <w:rFonts w:ascii="Times New Roman" w:hAnsi="Times New Roman" w:eastAsia="宋体"/>
+                <w:sz w:val="18"/>
+              </w:rPr>
               <w:t xml:space="preserve">            + "ROUND(SUM(CASE WHEN sc.score&gt;=60 THEN 1 ELSE 0 END)*100.0/COUNT(sc.id),2) AS pass_rate "</w:t>
               <w:br/>
+            </w:r>
+            <w:r>
+              <w:rPr>
+                <w:rFonts w:ascii="Times New Roman" w:hAnsi="Times New Roman" w:eastAsia="宋体"/>
+                <w:sz w:val="18"/>
+              </w:rPr>
               <w:t xml:space="preserve">            + "FROM t_course c JOIN t_score sc ON c.course_no = sc.course_no "</w:t>
               <w:br/>
+            </w:r>
+            <w:r>
+              <w:rPr>
+                <w:rFonts w:ascii="Times New Roman" w:hAnsi="Times New Roman" w:eastAsia="宋体"/>
+                <w:sz w:val="18"/>
+              </w:rPr>
               <w:t xml:space="preserve">            + "GROUP BY c.course_no, c.course_name ORDER BY c.course_no";</w:t>
               <w:br/>
+            </w:r>
+            <w:r>
+              <w:rPr>
+                <w:rFonts w:ascii="Times New Roman" w:hAnsi="Times New Roman" w:eastAsia="宋体"/>
+                <w:sz w:val="18"/>
+              </w:rPr>
               <w:t xml:space="preserve">    List&lt;CourseStat&gt; list = new ArrayList&lt;&gt;();</w:t>
               <w:br/>
+            </w:r>
+            <w:r>
+              <w:rPr>
+                <w:rFonts w:ascii="Times New Roman" w:hAnsi="Times New Roman" w:eastAsia="宋体"/>
+                <w:sz w:val="18"/>
+              </w:rPr>
               <w:t xml:space="preserve">    Connection conn = null; PreparedStatement ps = null; ResultSet rs = null;</w:t>
               <w:br/>
+            </w:r>
+            <w:r>
+              <w:rPr>
+                <w:rFonts w:ascii="Times New Roman" w:hAnsi="Times New Roman" w:eastAsia="宋体"/>
+                <w:sz w:val="18"/>
+              </w:rPr>
               <w:t xml:space="preserve">    try {</w:t>
               <w:br/>
+            </w:r>
+            <w:r>
+              <w:rPr>
+                <w:rFonts w:ascii="Times New Roman" w:hAnsi="Times New Roman" w:eastAsia="宋体"/>
+                <w:sz w:val="18"/>
+              </w:rPr>
               <w:t xml:space="preserve">        conn = DBUtil.getConnection();</w:t>
               <w:br/>
+            </w:r>
+            <w:r>
+              <w:rPr>
+                <w:rFonts w:ascii="Times New Roman" w:hAnsi="Times New Roman" w:eastAsia="宋体"/>
+                <w:sz w:val="18"/>
+              </w:rPr>
               <w:t xml:space="preserve">        ps = conn.prepareStatement(sql);</w:t>
               <w:br/>
+            </w:r>
+            <w:r>
+              <w:rPr>
+                <w:rFonts w:ascii="Times New Roman" w:hAnsi="Times New Roman" w:eastAsia="宋体"/>
+                <w:sz w:val="18"/>
+              </w:rPr>
               <w:t xml:space="preserve">        rs = ps.executeQuery();</w:t>
               <w:br/>
+            </w:r>
+            <w:r>
+              <w:rPr>
+                <w:rFonts w:ascii="Times New Roman" w:hAnsi="Times New Roman" w:eastAsia="宋体"/>
+                <w:sz w:val="18"/>
+              </w:rPr>
               <w:t xml:space="preserve">        while (rs.next()) {</w:t>
               <w:br/>
+            </w:r>
+            <w:r>
+              <w:rPr>
+                <w:rFonts w:ascii="Times New Roman" w:hAnsi="Times New Roman" w:eastAsia="宋体"/>
+                <w:sz w:val="18"/>
+              </w:rPr>
               <w:t xml:space="preserve">            CourseStat s = new CourseStat();</w:t>
               <w:br/>
+            </w:r>
+            <w:r>
+              <w:rPr>
+                <w:rFonts w:ascii="Times New Roman" w:hAnsi="Times New Roman" w:eastAsia="宋体"/>
+                <w:sz w:val="18"/>
+              </w:rPr>
               <w:t xml:space="preserve">            s.setCourseNo(rs.getString("course_no"));</w:t>
               <w:br/>
+            </w:r>
+            <w:r>
+              <w:rPr>
+                <w:rFonts w:ascii="Times New Roman" w:hAnsi="Times New Roman" w:eastAsia="宋体"/>
+                <w:sz w:val="18"/>
+              </w:rPr>
               <w:t xml:space="preserve">            s.setCourseName(rs.getString("course_name"));</w:t>
               <w:br/>
+            </w:r>
+            <w:r>
+              <w:rPr>
+                <w:rFonts w:ascii="Times New Roman" w:hAnsi="Times New Roman" w:eastAsia="宋体"/>
+                <w:sz w:val="18"/>
+              </w:rPr>
               <w:t xml:space="preserve">            s.setCount(rs.getInt("cnt"));</w:t>
               <w:br/>
+            </w:r>
+            <w:r>
+              <w:rPr>
+                <w:rFonts w:ascii="Times New Roman" w:hAnsi="Times New Roman" w:eastAsia="宋体"/>
+                <w:sz w:val="18"/>
+              </w:rPr>
               <w:t xml:space="preserve">            s.setAvgScore(rs.getBigDecimal("avg_score"));</w:t>
               <w:br/>
+            </w:r>
+            <w:r>
+              <w:rPr>
+                <w:rFonts w:ascii="Times New Roman" w:hAnsi="Times New Roman" w:eastAsia="宋体"/>
+                <w:sz w:val="18"/>
+              </w:rPr>
               <w:t xml:space="preserve">            s.setMaxScore(rs.getBigDecimal("max_score"));</w:t>
               <w:br/>
+            </w:r>
+            <w:r>
+              <w:rPr>
+                <w:rFonts w:ascii="Times New Roman" w:hAnsi="Times New Roman" w:eastAsia="宋体"/>
+                <w:sz w:val="18"/>
+              </w:rPr>
               <w:t xml:space="preserve">            s.setMinScore(rs.getBigDecimal("min_score"));</w:t>
               <w:br/>
+            </w:r>
+            <w:r>
+              <w:rPr>
+                <w:rFonts w:ascii="Times New Roman" w:hAnsi="Times New Roman" w:eastAsia="宋体"/>
+                <w:sz w:val="18"/>
+              </w:rPr>
               <w:t xml:space="preserve">            s.setPassRate(rs.getBigDecimal("pass_rate"));</w:t>
               <w:br/>
+            </w:r>
+            <w:r>
+              <w:rPr>
+                <w:rFonts w:ascii="Times New Roman" w:hAnsi="Times New Roman" w:eastAsia="宋体"/>
+                <w:sz w:val="18"/>
+              </w:rPr>
               <w:t xml:space="preserve">            list.add(s);</w:t>
               <w:br/>
+            </w:r>
+            <w:r>
+              <w:rPr>
+                <w:rFonts w:ascii="Times New Roman" w:hAnsi="Times New Roman" w:eastAsia="宋体"/>
+                <w:sz w:val="18"/>
+              </w:rPr>
               <w:t xml:space="preserve">        }</w:t>
               <w:br/>
+            </w:r>
+            <w:r>
+              <w:rPr>
+                <w:rFonts w:ascii="Times New Roman" w:hAnsi="Times New Roman" w:eastAsia="宋体"/>
+                <w:sz w:val="18"/>
+              </w:rPr>
               <w:t xml:space="preserve">        return list;</w:t>
               <w:br/>
+            </w:r>
+            <w:r>
+              <w:rPr>
+                <w:rFonts w:ascii="Times New Roman" w:hAnsi="Times New Roman" w:eastAsia="宋体"/>
+                <w:sz w:val="18"/>
+              </w:rPr>
               <w:t xml:space="preserve">    } catch (SQLException e) {</w:t>
               <w:br/>
+            </w:r>
+            <w:r>
+              <w:rPr>
+                <w:rFonts w:ascii="Times New Roman" w:hAnsi="Times New Roman" w:eastAsia="宋体"/>
+                <w:sz w:val="18"/>
+              </w:rPr>
               <w:t xml:space="preserve">        throw new DataAccessException("统计课程成绩失败", e);</w:t>
               <w:br/>
+            </w:r>
+            <w:r>
+              <w:rPr>
+                <w:rFonts w:ascii="Times New Roman" w:hAnsi="Times New Roman" w:eastAsia="宋体"/>
+                <w:sz w:val="18"/>
+              </w:rPr>
               <w:t xml:space="preserve">    } finally {</w:t>
               <w:br/>
+            </w:r>
+            <w:r>
+              <w:rPr>
+                <w:rFonts w:ascii="Times New Roman" w:hAnsi="Times New Roman" w:eastAsia="宋体"/>
+                <w:sz w:val="18"/>
+              </w:rPr>
               <w:t xml:space="preserve">        DBUtil.close(conn, ps, rs);</w:t>
               <w:br/>
+            </w:r>
+            <w:r>
+              <w:rPr>
+                <w:rFonts w:ascii="Times New Roman" w:hAnsi="Times New Roman" w:eastAsia="宋体"/>
+                <w:sz w:val="18"/>
+              </w:rPr>
               <w:t xml:space="preserve">    }</w:t>
               <w:br/>
+            </w:r>
+            <w:r>
+              <w:rPr>
+                <w:rFonts w:ascii="Times New Roman" w:hAnsi="Times New Roman" w:eastAsia="宋体"/>
+                <w:sz w:val="18"/>
+              </w:rPr>
               <w:t>}</w:t>
             </w:r>
           </w:p>
@@ -1834,58 +2560,196 @@
           <w:p>
             <w:pPr>
               <w:spacing w:line="240" w:lineRule="auto"/>
+              <w:jc w:val="left"/>
             </w:pPr>
             <w:r>
               <w:rPr>
-                <w:rFonts w:ascii="Times New Roman" w:hAnsi="Times New Roman" w:eastAsia="Times New Roman"/>
-                <w:b w:val="0"/>
+                <w:rFonts w:ascii="Times New Roman" w:hAnsi="Times New Roman" w:eastAsia="宋体"/>
                 <w:sz w:val="18"/>
               </w:rPr>
               <w:t>public void add(String studentNo, String courseNo, BigDecimal score) {</w:t>
               <w:br/>
+            </w:r>
+            <w:r>
+              <w:rPr>
+                <w:rFonts w:ascii="Times New Roman" w:hAnsi="Times New Roman" w:eastAsia="宋体"/>
+                <w:sz w:val="18"/>
+              </w:rPr>
               <w:t xml:space="preserve">    checkScore(score);                                   // 0~100 范围校验</w:t>
               <w:br/>
+            </w:r>
+            <w:r>
+              <w:rPr>
+                <w:rFonts w:ascii="Times New Roman" w:hAnsi="Times New Roman" w:eastAsia="宋体"/>
+                <w:sz w:val="18"/>
+              </w:rPr>
               <w:t xml:space="preserve">    if (studentDao.findByNo(studentNo) == null) {</w:t>
               <w:br/>
+            </w:r>
+            <w:r>
+              <w:rPr>
+                <w:rFonts w:ascii="Times New Roman" w:hAnsi="Times New Roman" w:eastAsia="宋体"/>
+                <w:sz w:val="18"/>
+              </w:rPr>
               <w:t xml:space="preserve">        throw new BusinessException("学号 " + studentNo + " 的学生不存在");</w:t>
               <w:br/>
+            </w:r>
+            <w:r>
+              <w:rPr>
+                <w:rFonts w:ascii="Times New Roman" w:hAnsi="Times New Roman" w:eastAsia="宋体"/>
+                <w:sz w:val="18"/>
+              </w:rPr>
               <w:t xml:space="preserve">    }</w:t>
               <w:br/>
+            </w:r>
+            <w:r>
+              <w:rPr>
+                <w:rFonts w:ascii="Times New Roman" w:hAnsi="Times New Roman" w:eastAsia="宋体"/>
+                <w:sz w:val="18"/>
+              </w:rPr>
               <w:t xml:space="preserve">    if (courseDao.findByNo(courseNo) == null) {</w:t>
               <w:br/>
+            </w:r>
+            <w:r>
+              <w:rPr>
+                <w:rFonts w:ascii="Times New Roman" w:hAnsi="Times New Roman" w:eastAsia="宋体"/>
+                <w:sz w:val="18"/>
+              </w:rPr>
               <w:t xml:space="preserve">        throw new BusinessException("课程编号 " + courseNo + " 不存在");</w:t>
               <w:br/>
+            </w:r>
+            <w:r>
+              <w:rPr>
+                <w:rFonts w:ascii="Times New Roman" w:hAnsi="Times New Roman" w:eastAsia="宋体"/>
+                <w:sz w:val="18"/>
+              </w:rPr>
               <w:t xml:space="preserve">    }</w:t>
               <w:br/>
+            </w:r>
+            <w:r>
+              <w:rPr>
+                <w:rFonts w:ascii="Times New Roman" w:hAnsi="Times New Roman" w:eastAsia="宋体"/>
+                <w:sz w:val="18"/>
+              </w:rPr>
               <w:t xml:space="preserve">    if (scoreDao.exists(studentNo, courseNo)) {</w:t>
               <w:br/>
+            </w:r>
+            <w:r>
+              <w:rPr>
+                <w:rFonts w:ascii="Times New Roman" w:hAnsi="Times New Roman" w:eastAsia="宋体"/>
+                <w:sz w:val="18"/>
+              </w:rPr>
               <w:t xml:space="preserve">        throw new BusinessException("该学生此课程成绩已存在，请使用修改功能");</w:t>
               <w:br/>
+            </w:r>
+            <w:r>
+              <w:rPr>
+                <w:rFonts w:ascii="Times New Roman" w:hAnsi="Times New Roman" w:eastAsia="宋体"/>
+                <w:sz w:val="18"/>
+              </w:rPr>
               <w:t xml:space="preserve">    }</w:t>
               <w:br/>
+            </w:r>
+            <w:r>
+              <w:rPr>
+                <w:rFonts w:ascii="Times New Roman" w:hAnsi="Times New Roman" w:eastAsia="宋体"/>
+                <w:sz w:val="18"/>
+              </w:rPr>
               <w:t xml:space="preserve">    Score s = new Score();</w:t>
               <w:br/>
+            </w:r>
+            <w:r>
+              <w:rPr>
+                <w:rFonts w:ascii="Times New Roman" w:hAnsi="Times New Roman" w:eastAsia="宋体"/>
+                <w:sz w:val="18"/>
+              </w:rPr>
               <w:t xml:space="preserve">    s.setStudentNo(studentNo);</w:t>
               <w:br/>
+            </w:r>
+            <w:r>
+              <w:rPr>
+                <w:rFonts w:ascii="Times New Roman" w:hAnsi="Times New Roman" w:eastAsia="宋体"/>
+                <w:sz w:val="18"/>
+              </w:rPr>
               <w:t xml:space="preserve">    s.setCourseNo(courseNo);</w:t>
               <w:br/>
+            </w:r>
+            <w:r>
+              <w:rPr>
+                <w:rFonts w:ascii="Times New Roman" w:hAnsi="Times New Roman" w:eastAsia="宋体"/>
+                <w:sz w:val="18"/>
+              </w:rPr>
               <w:t xml:space="preserve">    s.setScore(score);</w:t>
               <w:br/>
+            </w:r>
+            <w:r>
+              <w:rPr>
+                <w:rFonts w:ascii="Times New Roman" w:hAnsi="Times New Roman" w:eastAsia="宋体"/>
+                <w:sz w:val="18"/>
+              </w:rPr>
               <w:t xml:space="preserve">    scoreDao.insert(s);</w:t>
               <w:br/>
+            </w:r>
+            <w:r>
+              <w:rPr>
+                <w:rFonts w:ascii="Times New Roman" w:hAnsi="Times New Roman" w:eastAsia="宋体"/>
+                <w:sz w:val="18"/>
+              </w:rPr>
               <w:t>}</w:t>
               <w:br/>
+            </w:r>
+            <w:r>
+              <w:rPr>
+                <w:rFonts w:ascii="Times New Roman" w:hAnsi="Times New Roman" w:eastAsia="宋体"/>
+                <w:sz w:val="18"/>
+              </w:rPr>
               <w:br/>
+            </w:r>
+            <w:r>
+              <w:rPr>
+                <w:rFonts w:ascii="Times New Roman" w:hAnsi="Times New Roman" w:eastAsia="宋体"/>
+                <w:sz w:val="18"/>
+              </w:rPr>
               <w:t>private void checkScore(BigDecimal score) {</w:t>
               <w:br/>
+            </w:r>
+            <w:r>
+              <w:rPr>
+                <w:rFonts w:ascii="Times New Roman" w:hAnsi="Times New Roman" w:eastAsia="宋体"/>
+                <w:sz w:val="18"/>
+              </w:rPr>
               <w:t xml:space="preserve">    if (score == null || score.compareTo(BigDecimal.ZERO) &lt; 0</w:t>
               <w:br/>
+            </w:r>
+            <w:r>
+              <w:rPr>
+                <w:rFonts w:ascii="Times New Roman" w:hAnsi="Times New Roman" w:eastAsia="宋体"/>
+                <w:sz w:val="18"/>
+              </w:rPr>
               <w:t xml:space="preserve">            || score.compareTo(new BigDecimal("100")) &gt; 0) {</w:t>
               <w:br/>
+            </w:r>
+            <w:r>
+              <w:rPr>
+                <w:rFonts w:ascii="Times New Roman" w:hAnsi="Times New Roman" w:eastAsia="宋体"/>
+                <w:sz w:val="18"/>
+              </w:rPr>
               <w:t xml:space="preserve">        throw new BusinessException("成绩必须在 0-100 之间");</w:t>
               <w:br/>
+            </w:r>
+            <w:r>
+              <w:rPr>
+                <w:rFonts w:ascii="Times New Roman" w:hAnsi="Times New Roman" w:eastAsia="宋体"/>
+                <w:sz w:val="18"/>
+              </w:rPr>
               <w:t xml:space="preserve">    }</w:t>
               <w:br/>
+            </w:r>
+            <w:r>
+              <w:rPr>
+                <w:rFonts w:ascii="Times New Roman" w:hAnsi="Times New Roman" w:eastAsia="宋体"/>
+                <w:sz w:val="18"/>
+              </w:rPr>
               <w:t>}</w:t>
             </w:r>
           </w:p>
@@ -1970,74 +2834,260 @@
           <w:p>
             <w:pPr>
               <w:spacing w:line="240" w:lineRule="auto"/>
+              <w:jc w:val="left"/>
             </w:pPr>
             <w:r>
               <w:rPr>
-                <w:rFonts w:ascii="Times New Roman" w:hAnsi="Times New Roman" w:eastAsia="Times New Roman"/>
-                <w:b w:val="0"/>
+                <w:rFonts w:ascii="Times New Roman" w:hAnsi="Times New Roman" w:eastAsia="宋体"/>
                 <w:sz w:val="18"/>
               </w:rPr>
               <w:t>@WebServlet("/student")</w:t>
               <w:br/>
+            </w:r>
+            <w:r>
+              <w:rPr>
+                <w:rFonts w:ascii="Times New Roman" w:hAnsi="Times New Roman" w:eastAsia="宋体"/>
+                <w:sz w:val="18"/>
+              </w:rPr>
               <w:t>public class StudentServlet extends HttpServlet {</w:t>
               <w:br/>
+            </w:r>
+            <w:r>
+              <w:rPr>
+                <w:rFonts w:ascii="Times New Roman" w:hAnsi="Times New Roman" w:eastAsia="宋体"/>
+                <w:sz w:val="18"/>
+              </w:rPr>
               <w:t xml:space="preserve">    private final StudentService studentService = new StudentService();</w:t>
               <w:br/>
+            </w:r>
+            <w:r>
+              <w:rPr>
+                <w:rFonts w:ascii="Times New Roman" w:hAnsi="Times New Roman" w:eastAsia="宋体"/>
+                <w:sz w:val="18"/>
+              </w:rPr>
               <w:br/>
+            </w:r>
+            <w:r>
+              <w:rPr>
+                <w:rFonts w:ascii="Times New Roman" w:hAnsi="Times New Roman" w:eastAsia="宋体"/>
+                <w:sz w:val="18"/>
+              </w:rPr>
               <w:t xml:space="preserve">    @Override</w:t>
               <w:br/>
+            </w:r>
+            <w:r>
+              <w:rPr>
+                <w:rFonts w:ascii="Times New Roman" w:hAnsi="Times New Roman" w:eastAsia="宋体"/>
+                <w:sz w:val="18"/>
+              </w:rPr>
               <w:t xml:space="preserve">    protected void doGet(HttpServletRequest req, HttpServletResponse resp)</w:t>
               <w:br/>
+            </w:r>
+            <w:r>
+              <w:rPr>
+                <w:rFonts w:ascii="Times New Roman" w:hAnsi="Times New Roman" w:eastAsia="宋体"/>
+                <w:sz w:val="18"/>
+              </w:rPr>
               <w:t xml:space="preserve">            throws ServletException, IOException {</w:t>
               <w:br/>
+            </w:r>
+            <w:r>
+              <w:rPr>
+                <w:rFonts w:ascii="Times New Roman" w:hAnsi="Times New Roman" w:eastAsia="宋体"/>
+                <w:sz w:val="18"/>
+              </w:rPr>
               <w:t xml:space="preserve">        String action = param(req, "action", "list");</w:t>
               <w:br/>
+            </w:r>
+            <w:r>
+              <w:rPr>
+                <w:rFonts w:ascii="Times New Roman" w:hAnsi="Times New Roman" w:eastAsia="宋体"/>
+                <w:sz w:val="18"/>
+              </w:rPr>
               <w:t xml:space="preserve">        try {</w:t>
               <w:br/>
+            </w:r>
+            <w:r>
+              <w:rPr>
+                <w:rFonts w:ascii="Times New Roman" w:hAnsi="Times New Roman" w:eastAsia="宋体"/>
+                <w:sz w:val="18"/>
+              </w:rPr>
               <w:t xml:space="preserve">            switch (action) {</w:t>
               <w:br/>
+            </w:r>
+            <w:r>
+              <w:rPr>
+                <w:rFonts w:ascii="Times New Roman" w:hAnsi="Times New Roman" w:eastAsia="宋体"/>
+                <w:sz w:val="18"/>
+              </w:rPr>
               <w:t xml:space="preserve">                case "add":</w:t>
               <w:br/>
+            </w:r>
+            <w:r>
+              <w:rPr>
+                <w:rFonts w:ascii="Times New Roman" w:hAnsi="Times New Roman" w:eastAsia="宋体"/>
+                <w:sz w:val="18"/>
+              </w:rPr>
               <w:t xml:space="preserve">                    req.setAttribute("mode", "add");</w:t>
               <w:br/>
+            </w:r>
+            <w:r>
+              <w:rPr>
+                <w:rFonts w:ascii="Times New Roman" w:hAnsi="Times New Roman" w:eastAsia="宋体"/>
+                <w:sz w:val="18"/>
+              </w:rPr>
               <w:t xml:space="preserve">                    req.getRequestDispatcher("/student_form.jsp").forward(req, resp);</w:t>
               <w:br/>
+            </w:r>
+            <w:r>
+              <w:rPr>
+                <w:rFonts w:ascii="Times New Roman" w:hAnsi="Times New Roman" w:eastAsia="宋体"/>
+                <w:sz w:val="18"/>
+              </w:rPr>
               <w:t xml:space="preserve">                    break;</w:t>
               <w:br/>
+            </w:r>
+            <w:r>
+              <w:rPr>
+                <w:rFonts w:ascii="Times New Roman" w:hAnsi="Times New Roman" w:eastAsia="宋体"/>
+                <w:sz w:val="18"/>
+              </w:rPr>
               <w:t xml:space="preserve">                case "edit":</w:t>
               <w:br/>
+            </w:r>
+            <w:r>
+              <w:rPr>
+                <w:rFonts w:ascii="Times New Roman" w:hAnsi="Times New Roman" w:eastAsia="宋体"/>
+                <w:sz w:val="18"/>
+              </w:rPr>
               <w:t xml:space="preserve">                    req.setAttribute("mode", "edit");</w:t>
               <w:br/>
+            </w:r>
+            <w:r>
+              <w:rPr>
+                <w:rFonts w:ascii="Times New Roman" w:hAnsi="Times New Roman" w:eastAsia="宋体"/>
+                <w:sz w:val="18"/>
+              </w:rPr>
               <w:t xml:space="preserve">                    req.setAttribute("student", studentService.get(req.getParameter("no")));</w:t>
               <w:br/>
+            </w:r>
+            <w:r>
+              <w:rPr>
+                <w:rFonts w:ascii="Times New Roman" w:hAnsi="Times New Roman" w:eastAsia="宋体"/>
+                <w:sz w:val="18"/>
+              </w:rPr>
               <w:t xml:space="preserve">                    req.getRequestDispatcher("/student_form.jsp").forward(req, resp);</w:t>
               <w:br/>
+            </w:r>
+            <w:r>
+              <w:rPr>
+                <w:rFonts w:ascii="Times New Roman" w:hAnsi="Times New Roman" w:eastAsia="宋体"/>
+                <w:sz w:val="18"/>
+              </w:rPr>
               <w:t xml:space="preserve">                    break;</w:t>
               <w:br/>
+            </w:r>
+            <w:r>
+              <w:rPr>
+                <w:rFonts w:ascii="Times New Roman" w:hAnsi="Times New Roman" w:eastAsia="宋体"/>
+                <w:sz w:val="18"/>
+              </w:rPr>
               <w:t xml:space="preserve">                case "delete":</w:t>
               <w:br/>
+            </w:r>
+            <w:r>
+              <w:rPr>
+                <w:rFonts w:ascii="Times New Roman" w:hAnsi="Times New Roman" w:eastAsia="宋体"/>
+                <w:sz w:val="18"/>
+              </w:rPr>
               <w:t xml:space="preserve">                    studentService.delete(req.getParameter("no"));</w:t>
               <w:br/>
+            </w:r>
+            <w:r>
+              <w:rPr>
+                <w:rFonts w:ascii="Times New Roman" w:hAnsi="Times New Roman" w:eastAsia="宋体"/>
+                <w:sz w:val="18"/>
+              </w:rPr>
               <w:t xml:space="preserve">                    resp.sendRedirect(req.getContextPath() + "/student?msg=删除成功");</w:t>
               <w:br/>
+            </w:r>
+            <w:r>
+              <w:rPr>
+                <w:rFonts w:ascii="Times New Roman" w:hAnsi="Times New Roman" w:eastAsia="宋体"/>
+                <w:sz w:val="18"/>
+              </w:rPr>
               <w:t xml:space="preserve">                    break;</w:t>
               <w:br/>
+            </w:r>
+            <w:r>
+              <w:rPr>
+                <w:rFonts w:ascii="Times New Roman" w:hAnsi="Times New Roman" w:eastAsia="宋体"/>
+                <w:sz w:val="18"/>
+              </w:rPr>
               <w:t xml:space="preserve">                default:</w:t>
               <w:br/>
+            </w:r>
+            <w:r>
+              <w:rPr>
+                <w:rFonts w:ascii="Times New Roman" w:hAnsi="Times New Roman" w:eastAsia="宋体"/>
+                <w:sz w:val="18"/>
+              </w:rPr>
               <w:t xml:space="preserve">                    list(req, resp);</w:t>
               <w:br/>
+            </w:r>
+            <w:r>
+              <w:rPr>
+                <w:rFonts w:ascii="Times New Roman" w:hAnsi="Times New Roman" w:eastAsia="宋体"/>
+                <w:sz w:val="18"/>
+              </w:rPr>
               <w:t xml:space="preserve">            }</w:t>
               <w:br/>
+            </w:r>
+            <w:r>
+              <w:rPr>
+                <w:rFonts w:ascii="Times New Roman" w:hAnsi="Times New Roman" w:eastAsia="宋体"/>
+                <w:sz w:val="18"/>
+              </w:rPr>
               <w:t xml:space="preserve">        } catch (BusinessException e) {</w:t>
               <w:br/>
+            </w:r>
+            <w:r>
+              <w:rPr>
+                <w:rFonts w:ascii="Times New Roman" w:hAnsi="Times New Roman" w:eastAsia="宋体"/>
+                <w:sz w:val="18"/>
+              </w:rPr>
               <w:t xml:space="preserve">            req.setAttribute("error", e.getMessage());</w:t>
               <w:br/>
+            </w:r>
+            <w:r>
+              <w:rPr>
+                <w:rFonts w:ascii="Times New Roman" w:hAnsi="Times New Roman" w:eastAsia="宋体"/>
+                <w:sz w:val="18"/>
+              </w:rPr>
               <w:t xml:space="preserve">            list(req, resp);</w:t>
               <w:br/>
+            </w:r>
+            <w:r>
+              <w:rPr>
+                <w:rFonts w:ascii="Times New Roman" w:hAnsi="Times New Roman" w:eastAsia="宋体"/>
+                <w:sz w:val="18"/>
+              </w:rPr>
               <w:t xml:space="preserve">        }</w:t>
               <w:br/>
+            </w:r>
+            <w:r>
+              <w:rPr>
+                <w:rFonts w:ascii="Times New Roman" w:hAnsi="Times New Roman" w:eastAsia="宋体"/>
+                <w:sz w:val="18"/>
+              </w:rPr>
               <w:t xml:space="preserve">    }</w:t>
               <w:br/>
+            </w:r>
+            <w:r>
+              <w:rPr>
+                <w:rFonts w:ascii="Times New Roman" w:hAnsi="Times New Roman" w:eastAsia="宋体"/>
+                <w:sz w:val="18"/>
+              </w:rPr>
               <w:t>}</w:t>
             </w:r>
           </w:p>
@@ -2122,51 +3172,171 @@
           <w:p>
             <w:pPr>
               <w:spacing w:line="240" w:lineRule="auto"/>
+              <w:jc w:val="left"/>
             </w:pPr>
             <w:r>
               <w:rPr>
-                <w:rFonts w:ascii="Times New Roman" w:hAnsi="Times New Roman" w:eastAsia="Times New Roman"/>
-                <w:b w:val="0"/>
+                <w:rFonts w:ascii="Times New Roman" w:hAnsi="Times New Roman" w:eastAsia="宋体"/>
                 <w:sz w:val="18"/>
               </w:rPr>
               <w:t>@WebFilter("/*")</w:t>
               <w:br/>
+            </w:r>
+            <w:r>
+              <w:rPr>
+                <w:rFonts w:ascii="Times New Roman" w:hAnsi="Times New Roman" w:eastAsia="宋体"/>
+                <w:sz w:val="18"/>
+              </w:rPr>
               <w:t>public class AuthFilter implements Filter {</w:t>
               <w:br/>
+            </w:r>
+            <w:r>
+              <w:rPr>
+                <w:rFonts w:ascii="Times New Roman" w:hAnsi="Times New Roman" w:eastAsia="宋体"/>
+                <w:sz w:val="18"/>
+              </w:rPr>
               <w:t xml:space="preserve">    @Override</w:t>
               <w:br/>
+            </w:r>
+            <w:r>
+              <w:rPr>
+                <w:rFonts w:ascii="Times New Roman" w:hAnsi="Times New Roman" w:eastAsia="宋体"/>
+                <w:sz w:val="18"/>
+              </w:rPr>
               <w:t xml:space="preserve">    public void doFilter(ServletRequest request, ServletResponse response, FilterChain chain)</w:t>
               <w:br/>
+            </w:r>
+            <w:r>
+              <w:rPr>
+                <w:rFonts w:ascii="Times New Roman" w:hAnsi="Times New Roman" w:eastAsia="宋体"/>
+                <w:sz w:val="18"/>
+              </w:rPr>
               <w:t xml:space="preserve">            throws IOException, ServletException {</w:t>
               <w:br/>
+            </w:r>
+            <w:r>
+              <w:rPr>
+                <w:rFonts w:ascii="Times New Roman" w:hAnsi="Times New Roman" w:eastAsia="宋体"/>
+                <w:sz w:val="18"/>
+              </w:rPr>
               <w:t xml:space="preserve">        HttpServletRequest req = (HttpServletRequest) request;</w:t>
               <w:br/>
+            </w:r>
+            <w:r>
+              <w:rPr>
+                <w:rFonts w:ascii="Times New Roman" w:hAnsi="Times New Roman" w:eastAsia="宋体"/>
+                <w:sz w:val="18"/>
+              </w:rPr>
               <w:t xml:space="preserve">        HttpServletResponse resp = (HttpServletResponse) response;</w:t>
               <w:br/>
+            </w:r>
+            <w:r>
+              <w:rPr>
+                <w:rFonts w:ascii="Times New Roman" w:hAnsi="Times New Roman" w:eastAsia="宋体"/>
+                <w:sz w:val="18"/>
+              </w:rPr>
               <w:t xml:space="preserve">        String path = req.getServletPath();</w:t>
               <w:br/>
+            </w:r>
+            <w:r>
+              <w:rPr>
+                <w:rFonts w:ascii="Times New Roman" w:hAnsi="Times New Roman" w:eastAsia="宋体"/>
+                <w:sz w:val="18"/>
+              </w:rPr>
               <w:br/>
+            </w:r>
+            <w:r>
+              <w:rPr>
+                <w:rFonts w:ascii="Times New Roman" w:hAnsi="Times New Roman" w:eastAsia="宋体"/>
+                <w:sz w:val="18"/>
+              </w:rPr>
               <w:t xml:space="preserve">        boolean isPublic = path.equals("/login") || path.equals("/login.jsp")</w:t>
               <w:br/>
+            </w:r>
+            <w:r>
+              <w:rPr>
+                <w:rFonts w:ascii="Times New Roman" w:hAnsi="Times New Roman" w:eastAsia="宋体"/>
+                <w:sz w:val="18"/>
+              </w:rPr>
               <w:t xml:space="preserve">                || path.startsWith("/css/") || path.equals("/");</w:t>
               <w:br/>
+            </w:r>
+            <w:r>
+              <w:rPr>
+                <w:rFonts w:ascii="Times New Roman" w:hAnsi="Times New Roman" w:eastAsia="宋体"/>
+                <w:sz w:val="18"/>
+              </w:rPr>
               <w:t xml:space="preserve">        HttpSession session = req.getSession(false);</w:t>
               <w:br/>
+            </w:r>
+            <w:r>
+              <w:rPr>
+                <w:rFonts w:ascii="Times New Roman" w:hAnsi="Times New Roman" w:eastAsia="宋体"/>
+                <w:sz w:val="18"/>
+              </w:rPr>
               <w:t xml:space="preserve">        boolean loggedIn = session != null &amp;&amp; session.getAttribute("loginUser") != null;</w:t>
               <w:br/>
+            </w:r>
+            <w:r>
+              <w:rPr>
+                <w:rFonts w:ascii="Times New Roman" w:hAnsi="Times New Roman" w:eastAsia="宋体"/>
+                <w:sz w:val="18"/>
+              </w:rPr>
               <w:br/>
+            </w:r>
+            <w:r>
+              <w:rPr>
+                <w:rFonts w:ascii="Times New Roman" w:hAnsi="Times New Roman" w:eastAsia="宋体"/>
+                <w:sz w:val="18"/>
+              </w:rPr>
               <w:t xml:space="preserve">        if (isPublic || loggedIn) {</w:t>
               <w:br/>
+            </w:r>
+            <w:r>
+              <w:rPr>
+                <w:rFonts w:ascii="Times New Roman" w:hAnsi="Times New Roman" w:eastAsia="宋体"/>
+                <w:sz w:val="18"/>
+              </w:rPr>
               <w:t xml:space="preserve">            chain.doFilter(request, response);</w:t>
               <w:br/>
+            </w:r>
+            <w:r>
+              <w:rPr>
+                <w:rFonts w:ascii="Times New Roman" w:hAnsi="Times New Roman" w:eastAsia="宋体"/>
+                <w:sz w:val="18"/>
+              </w:rPr>
               <w:t xml:space="preserve">        } else {</w:t>
               <w:br/>
+            </w:r>
+            <w:r>
+              <w:rPr>
+                <w:rFonts w:ascii="Times New Roman" w:hAnsi="Times New Roman" w:eastAsia="宋体"/>
+                <w:sz w:val="18"/>
+              </w:rPr>
               <w:t xml:space="preserve">            resp.sendRedirect(req.getContextPath() + "/login.jsp");</w:t>
               <w:br/>
+            </w:r>
+            <w:r>
+              <w:rPr>
+                <w:rFonts w:ascii="Times New Roman" w:hAnsi="Times New Roman" w:eastAsia="宋体"/>
+                <w:sz w:val="18"/>
+              </w:rPr>
               <w:t xml:space="preserve">        }</w:t>
               <w:br/>
+            </w:r>
+            <w:r>
+              <w:rPr>
+                <w:rFonts w:ascii="Times New Roman" w:hAnsi="Times New Roman" w:eastAsia="宋体"/>
+                <w:sz w:val="18"/>
+              </w:rPr>
               <w:t xml:space="preserve">    }</w:t>
               <w:br/>
+            </w:r>
+            <w:r>
+              <w:rPr>
+                <w:rFonts w:ascii="Times New Roman" w:hAnsi="Times New Roman" w:eastAsia="宋体"/>
+                <w:sz w:val="18"/>
+              </w:rPr>
               <w:t>}</w:t>
             </w:r>
           </w:p>

</xml_diff>